<commit_message>
Lab02: draft report content (architecture, training, ablation baseline, discussion)
Co-Authored-By: Claude Sonnet 5.5 <noreply@anthropic.com>
Claude-Session: https://claude.ai/code/session_01P6RdPC5AV61n2e3qSM1CP7
</commit_message>
<xml_diff>
--- a/Lab02/report/Lab02_report_115505009.docx
+++ b/Lab02/report/Lab02_report_115505009.docx
@@ -275,6 +275,28 @@
     </w:p>
     <w:p>
       <w:pPr>
+        <w:spacing w:after="60"/>
+        <w:ind w:left="340"/>
+      </w:pPr>
+      <w:r>
+        <w:rPr/>
+        <w:t>參數量：3,291,394（trainable parameters，由 notebook 的 `n_params` 印出）。</w:t>
+      </w:r>
+    </w:p>
+    <w:p>
+      <w:pPr>
+        <w:spacing w:after="60"/>
+        <w:ind w:left="340"/>
+      </w:pPr>
+      <w:r>
+        <w:rPr>
+          <w:highlight w:val="yellow"/>
+        </w:rPr>
+        <w:t>【待填：貼上 "trainable parameters: ..." 輸出截圖】</w:t>
+      </w:r>
+    </w:p>
+    <w:p>
+      <w:pPr>
         <w:pStyle w:val="a6"/>
         <w:numPr>
           <w:ilvl w:val="0"/>
@@ -320,6 +342,38 @@
           <w:rFonts w:hint="eastAsia"/>
         </w:rPr>
         <w:t xml:space="preserve">: </w:t>
+      </w:r>
+    </w:p>
+    <w:p>
+      <w:pPr>
+        <w:spacing w:after="60"/>
+        <w:ind w:left="340"/>
+      </w:pPr>
+      <w:r>
+        <w:rPr/>
+        <w:t>Baseline 公開測試集 PSNR：25.060 dB（grey baseline 23.49 dB，+1.570 dB）；最終版：</w:t>
+      </w:r>
+      <w:r>
+        <w:rPr>
+          <w:highlight w:val="yellow"/>
+        </w:rPr>
+        <w:t>【待填：最終 test PSNR (Base)】</w:t>
+      </w:r>
+      <w:r>
+        <w:rPr/>
+        <w:t xml:space="preserve"> dB。</w:t>
+      </w:r>
+    </w:p>
+    <w:p>
+      <w:pPr>
+        <w:spacing w:after="60"/>
+        <w:ind w:left="340"/>
+      </w:pPr>
+      <w:r>
+        <w:rPr>
+          <w:highlight w:val="yellow"/>
+        </w:rPr>
+        <w:t>【待填：貼上最終 "test PSNR (Base)" 輸出截圖】</w:t>
       </w:r>
     </w:p>
     <w:p/>
@@ -375,48 +429,531 @@
     </w:p>
     <w:p>
       <w:pPr>
-        <w:pStyle w:val="a6"/>
-        <w:ind w:leftChars="0"/>
-        <w:rPr>
-          <w:i/>
-          <w:iCs/>
-          <w:color w:val="BFBFBF" w:themeColor="background1" w:themeShade="BF"/>
-        </w:rPr>
-      </w:pPr>
-      <w:r>
-        <w:rPr>
-          <w:rFonts w:hint="eastAsia"/>
+        <w:spacing w:after="60"/>
+        <w:ind w:left="340"/>
+      </w:pPr>
+      <w:r>
+        <w:rPr/>
+        <w:t>網路為純卷積的 U-Net（ColorizationCNN，base_channels = 32，共 3,291,394 個參數），輸入為正規化的 L 通道 (1×32×32)，輸出為 tanh 限制在 [-1, 1] 的 a*b* (2×32×32)（真實值 = 輸出 × 110）。全部由 Conv2d / ConvTranspose2d + BatchNorm + ReLU 組成，沒有 Linear 或 attention。</w:t>
+      </w:r>
+    </w:p>
+    <w:tbl>
+      <w:tblPr>
+        <w:tblStyle w:val="a5"/>
+        <w:tblW w:type="auto" w:w="0"/>
+        <w:tblLook w:firstColumn="1" w:firstRow="1" w:lastColumn="0" w:lastRow="0" w:noHBand="0" w:noVBand="1" w:val="04A0"/>
+      </w:tblPr>
+      <w:tblGrid>
+        <w:gridCol w:w="3249"/>
+        <w:gridCol w:w="3249"/>
+        <w:gridCol w:w="3249"/>
+      </w:tblGrid>
+      <w:tr>
+        <w:tc>
+          <w:tcPr>
+            <w:tcW w:type="dxa" w:w="3249"/>
+          </w:tcPr>
+          <w:p>
+            <w:r/>
+            <w:r>
+              <w:rPr>
+                <w:b/>
+                <w:sz w:val="18"/>
+              </w:rPr>
+              <w:t>階段</w:t>
+            </w:r>
+          </w:p>
+        </w:tc>
+        <w:tc>
+          <w:tcPr>
+            <w:tcW w:type="dxa" w:w="3249"/>
+          </w:tcPr>
+          <w:p>
+            <w:r/>
+            <w:r>
+              <w:rPr>
+                <w:b/>
+                <w:sz w:val="18"/>
+              </w:rPr>
+              <w:t>運算</w:t>
+            </w:r>
+          </w:p>
+        </w:tc>
+        <w:tc>
+          <w:tcPr>
+            <w:tcW w:type="dxa" w:w="3249"/>
+          </w:tcPr>
+          <w:p>
+            <w:r/>
+            <w:r>
+              <w:rPr>
+                <w:b/>
+                <w:sz w:val="18"/>
+              </w:rPr>
+              <w:t>輸出大小</w:t>
+            </w:r>
+          </w:p>
+        </w:tc>
+      </w:tr>
+      <w:tr>
+        <w:tc>
+          <w:tcPr>
+            <w:tcW w:type="dxa" w:w="3249"/>
+          </w:tcPr>
+          <w:p>
+            <w:r/>
+            <w:r>
+              <w:rPr>
+                <w:sz w:val="18"/>
+              </w:rPr>
+              <w:t>Input</w:t>
+            </w:r>
+          </w:p>
+        </w:tc>
+        <w:tc>
+          <w:tcPr>
+            <w:tcW w:type="dxa" w:w="3249"/>
+          </w:tcPr>
+          <w:p>
+            <w:r/>
+            <w:r>
+              <w:rPr>
+                <w:sz w:val="18"/>
+              </w:rPr>
+              <w:t>L / 100</w:t>
+            </w:r>
+          </w:p>
+        </w:tc>
+        <w:tc>
+          <w:tcPr>
+            <w:tcW w:type="dxa" w:w="3249"/>
+          </w:tcPr>
+          <w:p>
+            <w:r/>
+            <w:r>
+              <w:rPr>
+                <w:sz w:val="18"/>
+              </w:rPr>
+              <w:t>1×32×32</w:t>
+            </w:r>
+          </w:p>
+        </w:tc>
+      </w:tr>
+      <w:tr>
+        <w:tc>
+          <w:tcPr>
+            <w:tcW w:type="dxa" w:w="3249"/>
+          </w:tcPr>
+          <w:p>
+            <w:r/>
+            <w:r>
+              <w:rPr>
+                <w:sz w:val="18"/>
+              </w:rPr>
+              <w:t>enc1</w:t>
+            </w:r>
+          </w:p>
+        </w:tc>
+        <w:tc>
+          <w:tcPr>
+            <w:tcW w:type="dxa" w:w="3249"/>
+          </w:tcPr>
+          <w:p>
+            <w:r/>
+            <w:r>
+              <w:rPr>
+                <w:sz w:val="18"/>
+              </w:rPr>
+              <w:t>[Conv3×3-BN-ReLU]×2，32 ch</w:t>
+            </w:r>
+          </w:p>
+        </w:tc>
+        <w:tc>
+          <w:tcPr>
+            <w:tcW w:type="dxa" w:w="3249"/>
+          </w:tcPr>
+          <w:p>
+            <w:r/>
+            <w:r>
+              <w:rPr>
+                <w:sz w:val="18"/>
+              </w:rPr>
+              <w:t>32×32×32</w:t>
+            </w:r>
+          </w:p>
+        </w:tc>
+      </w:tr>
+      <w:tr>
+        <w:tc>
+          <w:tcPr>
+            <w:tcW w:type="dxa" w:w="3249"/>
+          </w:tcPr>
+          <w:p>
+            <w:r/>
+            <w:r>
+              <w:rPr>
+                <w:sz w:val="18"/>
+              </w:rPr>
+              <w:t>down1 + enc2</w:t>
+            </w:r>
+          </w:p>
+        </w:tc>
+        <w:tc>
+          <w:tcPr>
+            <w:tcW w:type="dxa" w:w="3249"/>
+          </w:tcPr>
+          <w:p>
+            <w:r/>
+            <w:r>
+              <w:rPr>
+                <w:sz w:val="18"/>
+              </w:rPr>
+              <w:t>Conv3×3 stride 2，再 [Conv-BN-ReLU]×2，64 ch</w:t>
+            </w:r>
+          </w:p>
+        </w:tc>
+        <w:tc>
+          <w:tcPr>
+            <w:tcW w:type="dxa" w:w="3249"/>
+          </w:tcPr>
+          <w:p>
+            <w:r/>
+            <w:r>
+              <w:rPr>
+                <w:sz w:val="18"/>
+              </w:rPr>
+              <w:t>64×16×16</w:t>
+            </w:r>
+          </w:p>
+        </w:tc>
+      </w:tr>
+      <w:tr>
+        <w:tc>
+          <w:tcPr>
+            <w:tcW w:type="dxa" w:w="3249"/>
+          </w:tcPr>
+          <w:p>
+            <w:r/>
+            <w:r>
+              <w:rPr>
+                <w:sz w:val="18"/>
+              </w:rPr>
+              <w:t>down2 + enc3</w:t>
+            </w:r>
+          </w:p>
+        </w:tc>
+        <w:tc>
+          <w:tcPr>
+            <w:tcW w:type="dxa" w:w="3249"/>
+          </w:tcPr>
+          <w:p>
+            <w:r/>
+            <w:r>
+              <w:rPr>
+                <w:sz w:val="18"/>
+              </w:rPr>
+              <w:t>Conv3×3 stride 2，再 [Conv-BN-ReLU]×2，128 ch</w:t>
+            </w:r>
+          </w:p>
+        </w:tc>
+        <w:tc>
+          <w:tcPr>
+            <w:tcW w:type="dxa" w:w="3249"/>
+          </w:tcPr>
+          <w:p>
+            <w:r/>
+            <w:r>
+              <w:rPr>
+                <w:sz w:val="18"/>
+              </w:rPr>
+              <w:t>128×8×8</w:t>
+            </w:r>
+          </w:p>
+        </w:tc>
+      </w:tr>
+      <w:tr>
+        <w:tc>
+          <w:tcPr>
+            <w:tcW w:type="dxa" w:w="3249"/>
+          </w:tcPr>
+          <w:p>
+            <w:r/>
+            <w:r>
+              <w:rPr>
+                <w:sz w:val="18"/>
+              </w:rPr>
+              <w:t>down3 + mid</w:t>
+            </w:r>
+          </w:p>
+        </w:tc>
+        <w:tc>
+          <w:tcPr>
+            <w:tcW w:type="dxa" w:w="3249"/>
+          </w:tcPr>
+          <w:p>
+            <w:r/>
+            <w:r>
+              <w:rPr>
+                <w:sz w:val="18"/>
+              </w:rPr>
+              <w:t>Conv3×3 stride 2；Conv-BN-ReLU、dilated Conv (d=2)-BN-ReLU、Conv-BN-ReLU，256 ch</w:t>
+            </w:r>
+          </w:p>
+        </w:tc>
+        <w:tc>
+          <w:tcPr>
+            <w:tcW w:type="dxa" w:w="3249"/>
+          </w:tcPr>
+          <w:p>
+            <w:r/>
+            <w:r>
+              <w:rPr>
+                <w:sz w:val="18"/>
+              </w:rPr>
+              <w:t>256×4×4</w:t>
+            </w:r>
+          </w:p>
+        </w:tc>
+      </w:tr>
+      <w:tr>
+        <w:tc>
+          <w:tcPr>
+            <w:tcW w:type="dxa" w:w="3249"/>
+          </w:tcPr>
+          <w:p>
+            <w:r/>
+            <w:r>
+              <w:rPr>
+                <w:sz w:val="18"/>
+              </w:rPr>
+              <w:t>up3 + dec3</w:t>
+            </w:r>
+          </w:p>
+        </w:tc>
+        <w:tc>
+          <w:tcPr>
+            <w:tcW w:type="dxa" w:w="3249"/>
+          </w:tcPr>
+          <w:p>
+            <w:r/>
+            <w:r>
+              <w:rPr>
+                <w:sz w:val="18"/>
+              </w:rPr>
+              <w:t>ConvTranspose2×2 stride 2 → 128 ch，與 enc3 concat（256 ch），[Conv-BN-ReLU]×2 → 128 ch</w:t>
+            </w:r>
+          </w:p>
+        </w:tc>
+        <w:tc>
+          <w:tcPr>
+            <w:tcW w:type="dxa" w:w="3249"/>
+          </w:tcPr>
+          <w:p>
+            <w:r/>
+            <w:r>
+              <w:rPr>
+                <w:sz w:val="18"/>
+              </w:rPr>
+              <w:t>128×8×8</w:t>
+            </w:r>
+          </w:p>
+        </w:tc>
+      </w:tr>
+      <w:tr>
+        <w:tc>
+          <w:tcPr>
+            <w:tcW w:type="dxa" w:w="3249"/>
+          </w:tcPr>
+          <w:p>
+            <w:r/>
+            <w:r>
+              <w:rPr>
+                <w:sz w:val="18"/>
+              </w:rPr>
+              <w:t>up2 + dec2</w:t>
+            </w:r>
+          </w:p>
+        </w:tc>
+        <w:tc>
+          <w:tcPr>
+            <w:tcW w:type="dxa" w:w="3249"/>
+          </w:tcPr>
+          <w:p>
+            <w:r/>
+            <w:r>
+              <w:rPr>
+                <w:sz w:val="18"/>
+              </w:rPr>
+              <w:t>ConvTranspose → 64 ch，與 enc2 concat（128 ch），[Conv-BN-ReLU]×2 → 64 ch</w:t>
+            </w:r>
+          </w:p>
+        </w:tc>
+        <w:tc>
+          <w:tcPr>
+            <w:tcW w:type="dxa" w:w="3249"/>
+          </w:tcPr>
+          <w:p>
+            <w:r/>
+            <w:r>
+              <w:rPr>
+                <w:sz w:val="18"/>
+              </w:rPr>
+              <w:t>64×16×16</w:t>
+            </w:r>
+          </w:p>
+        </w:tc>
+      </w:tr>
+      <w:tr>
+        <w:tc>
+          <w:tcPr>
+            <w:tcW w:type="dxa" w:w="3249"/>
+          </w:tcPr>
+          <w:p>
+            <w:r/>
+            <w:r>
+              <w:rPr>
+                <w:sz w:val="18"/>
+              </w:rPr>
+              <w:t>up1 + dec1</w:t>
+            </w:r>
+          </w:p>
+        </w:tc>
+        <w:tc>
+          <w:tcPr>
+            <w:tcW w:type="dxa" w:w="3249"/>
+          </w:tcPr>
+          <w:p>
+            <w:r/>
+            <w:r>
+              <w:rPr>
+                <w:sz w:val="18"/>
+              </w:rPr>
+              <w:t>ConvTranspose → 32 ch，與 enc1 concat（64 ch），[Conv-BN-ReLU]×2 → 32 ch</w:t>
+            </w:r>
+          </w:p>
+        </w:tc>
+        <w:tc>
+          <w:tcPr>
+            <w:tcW w:type="dxa" w:w="3249"/>
+          </w:tcPr>
+          <w:p>
+            <w:r/>
+            <w:r>
+              <w:rPr>
+                <w:sz w:val="18"/>
+              </w:rPr>
+              <w:t>32×32×32</w:t>
+            </w:r>
+          </w:p>
+        </w:tc>
+      </w:tr>
+      <w:tr>
+        <w:tc>
+          <w:tcPr>
+            <w:tcW w:type="dxa" w:w="3249"/>
+          </w:tcPr>
+          <w:p>
+            <w:r/>
+            <w:r>
+              <w:rPr>
+                <w:sz w:val="18"/>
+              </w:rPr>
+              <w:t>head</w:t>
+            </w:r>
+          </w:p>
+        </w:tc>
+        <w:tc>
+          <w:tcPr>
+            <w:tcW w:type="dxa" w:w="3249"/>
+          </w:tcPr>
+          <w:p>
+            <w:r/>
+            <w:r>
+              <w:rPr>
+                <w:sz w:val="18"/>
+              </w:rPr>
+              <w:t>Conv1×1 → 2 ch，Tanh</w:t>
+            </w:r>
+          </w:p>
+        </w:tc>
+        <w:tc>
+          <w:tcPr>
+            <w:tcW w:type="dxa" w:w="3249"/>
+          </w:tcPr>
+          <w:p>
+            <w:r/>
+            <w:r>
+              <w:rPr>
+                <w:sz w:val="18"/>
+              </w:rPr>
+              <w:t>2×32×32</w:t>
+            </w:r>
+          </w:p>
+        </w:tc>
+      </w:tr>
+    </w:tbl>
+    <w:p/>
+    <w:p>
+      <w:pPr>
+        <w:spacing w:after="60"/>
+        <w:ind w:left="340"/>
+      </w:pPr>
+      <w:r>
+        <w:rPr>
           <w:b/>
-          <w:bCs/>
-          <w:i/>
-          <w:iCs/>
-          <w:color w:val="BFBFBF" w:themeColor="background1" w:themeShade="BF"/>
-        </w:rPr>
-        <w:t>(</w:t>
-      </w:r>
-      <w:r>
-        <w:rPr>
-          <w:i/>
-          <w:iCs/>
-          <w:color w:val="BFBFBF" w:themeColor="background1" w:themeShade="BF"/>
-        </w:rPr>
-        <w:t>A diagram or table of your network, the parameter count, and why it is shaped that way</w:t>
-      </w:r>
-      <w:r>
-        <w:rPr>
-          <w:rFonts w:hint="eastAsia"/>
-          <w:i/>
-          <w:iCs/>
-          <w:color w:val="BFBFBF" w:themeColor="background1" w:themeShade="BF"/>
-        </w:rPr>
-        <w:t>)</w:t>
-      </w:r>
-    </w:p>
-    <w:p>
-      <w:pPr>
-        <w:pStyle w:val="a6"/>
-        <w:ind w:leftChars="0"/>
-      </w:pPr>
+        </w:rPr>
+        <w:t>為什麼這樣設計：</w:t>
+      </w:r>
+    </w:p>
+    <w:p>
+      <w:pPr>
+        <w:spacing w:after="60"/>
+        <w:ind w:left="340"/>
+      </w:pPr>
+      <w:r>
+        <w:rPr/>
+        <w:t>1. U-Net 的 skip connection：上色只需預測 a*b*，L 通道已含完整的邊緣與紋理；把 encoder 各解析度的特徵直接接到 decoder，能讓顏色邊界對齊物體輪廓，避免顏色溢出。</w:t>
+      </w:r>
+    </w:p>
+    <w:p>
+      <w:pPr>
+        <w:spacing w:after="60"/>
+        <w:ind w:left="340"/>
+      </w:pPr>
+      <w:r>
+        <w:rPr/>
+        <w:t>2. 逐步下採樣到 4×4 並在 bottleneck 使用 dilated convolution：顏色取決於整張圖的語意（天空偏藍、草地偏綠），4×4 解析度加上膨脹卷積使感受野涵蓋整張 32×32 圖，補足純卷積缺少全域資訊的弱點。</w:t>
+      </w:r>
+    </w:p>
+    <w:p>
+      <w:pPr>
+        <w:spacing w:after="60"/>
+        <w:ind w:left="340"/>
+      </w:pPr>
+      <w:r>
+        <w:rPr/>
+        <w:t>3. 用 stride-2 卷積下採樣、ConvTranspose 上採樣，不使用 pooling，讓下採樣方式可學習。</w:t>
+      </w:r>
+    </w:p>
+    <w:p>
+      <w:pPr>
+        <w:spacing w:after="60"/>
+        <w:ind w:left="340"/>
+      </w:pPr>
+      <w:r>
+        <w:rPr/>
+        <w:t>4. BatchNorm 穩定訓練；輸出層用 Tanh，與 a*b*/110 的範圍一致，避免預測超出可能的色域。</w:t>
+      </w:r>
+    </w:p>
+    <w:p>
+      <w:pPr>
+        <w:spacing w:after="60"/>
+        <w:ind w:left="340"/>
+      </w:pPr>
+      <w:r>
+        <w:rPr/>
+        <w:t>5. 參數量約 330 萬，對 40,000 張 32×32 圖已足夠大（實驗中已出現過擬合，見 Discussion），所以沒有再加寬。</w:t>
+      </w:r>
     </w:p>
     <w:p>
       <w:pPr>
@@ -443,55 +980,102 @@
     </w:p>
     <w:p>
       <w:pPr>
-        <w:pStyle w:val="a6"/>
-        <w:ind w:leftChars="0"/>
-        <w:rPr>
-          <w:i/>
-          <w:iCs/>
-          <w:color w:val="BFBFBF" w:themeColor="background1" w:themeShade="BF"/>
-        </w:rPr>
-      </w:pPr>
-      <w:r>
-        <w:rPr>
-          <w:rFonts w:hint="eastAsia"/>
-          <w:i/>
-          <w:iCs/>
-          <w:color w:val="BFBFBF" w:themeColor="background1" w:themeShade="BF"/>
-        </w:rPr>
-        <w:t>(</w:t>
-      </w:r>
-      <w:r>
-        <w:rPr>
-          <w:i/>
-          <w:iCs/>
-          <w:color w:val="BFBFBF" w:themeColor="background1" w:themeShade="BF"/>
-        </w:rPr>
-        <w:t xml:space="preserve">Loss, </w:t>
-      </w:r>
-      <w:r>
-        <w:rPr>
-          <w:i/>
-          <w:iCs/>
-          <w:color w:val="BFBFBF" w:themeColor="background1" w:themeShade="BF"/>
-        </w:rPr>
-        <w:t>optimizer</w:t>
-      </w:r>
-      <w:r>
-        <w:rPr>
-          <w:i/>
-          <w:iCs/>
-          <w:color w:val="BFBFBF" w:themeColor="background1" w:themeShade="BF"/>
-        </w:rPr>
-        <w:t>, schedule, augmentation, epochs, hardware, wall-clock time</w:t>
-      </w:r>
-      <w:r>
-        <w:rPr>
-          <w:rFonts w:hint="eastAsia"/>
-          <w:i/>
-          <w:iCs/>
-          <w:color w:val="BFBFBF" w:themeColor="background1" w:themeShade="BF"/>
-        </w:rPr>
-        <w:t>)</w:t>
+        <w:spacing w:after="60"/>
+        <w:ind w:left="340"/>
+      </w:pPr>
+      <w:r>
+        <w:rPr/>
+        <w:t>最終版（Baseline 為其中不含 shift 增強與 EMA、訓練 60 epoch 的版本）：</w:t>
+      </w:r>
+    </w:p>
+    <w:p>
+      <w:pPr>
+        <w:spacing w:after="60"/>
+        <w:ind w:left="340"/>
+      </w:pPr>
+      <w:r>
+        <w:rPr/>
+        <w:t>• Loss：L1（nn.L1Loss），對正規化後的 a*b*（÷110）計算。</w:t>
+      </w:r>
+    </w:p>
+    <w:p>
+      <w:pPr>
+        <w:spacing w:after="60"/>
+        <w:ind w:left="340"/>
+      </w:pPr>
+      <w:r>
+        <w:rPr/>
+        <w:t>• Optimizer：Adam，學習率 1e-3，batch size 128。</w:t>
+      </w:r>
+    </w:p>
+    <w:p>
+      <w:pPr>
+        <w:spacing w:after="60"/>
+        <w:ind w:left="340"/>
+      </w:pPr>
+      <w:r>
+        <w:rPr/>
+        <w:t>• Schedule：CosineAnnealingLR，每個 epoch 更新一次，從 1e-3 降到 1e-5。</w:t>
+      </w:r>
+    </w:p>
+    <w:p>
+      <w:pPr>
+        <w:spacing w:after="60"/>
+        <w:ind w:left="340"/>
+      </w:pPr>
+      <w:r>
+        <w:rPr/>
+        <w:t>• Augmentation：隨機水平翻轉（p = 0.5，L 與 ab 同步翻轉）；隨機平移（reflect padding 3 px 後隨機裁回 32×32，L 與 ab 同步）。</w:t>
+      </w:r>
+    </w:p>
+    <w:p>
+      <w:pPr>
+        <w:spacing w:after="60"/>
+        <w:ind w:left="340"/>
+      </w:pPr>
+      <w:r>
+        <w:rPr/>
+        <w:t>• EMA：對權重做指數移動平均（decay 0.999，含 BN buffer），驗證與存檔都使用 EMA 權重；以驗證集 PSNR 最高的 epoch 作為提交的 checkpoint。</w:t>
+      </w:r>
+    </w:p>
+    <w:p>
+      <w:pPr>
+        <w:spacing w:after="60"/>
+        <w:ind w:left="340"/>
+      </w:pPr>
+      <w:r>
+        <w:rPr/>
+        <w:t>• Epochs：最終版 45 epoch（Baseline 60 epoch）。</w:t>
+      </w:r>
+    </w:p>
+    <w:p>
+      <w:pPr>
+        <w:spacing w:after="60"/>
+        <w:ind w:left="340"/>
+      </w:pPr>
+      <w:r>
+        <w:rPr/>
+        <w:t>• 硬體：Google Colab GPU。時間：Baseline 1717 s（約 29 s / epoch）；最終版</w:t>
+      </w:r>
+      <w:r>
+        <w:rPr>
+          <w:highlight w:val="yellow"/>
+        </w:rPr>
+        <w:t>【待填：total time】</w:t>
+      </w:r>
+      <w:r>
+        <w:rPr/>
+        <w:t xml:space="preserve"> s。</w:t>
+      </w:r>
+    </w:p>
+    <w:p>
+      <w:pPr>
+        <w:spacing w:after="60"/>
+        <w:ind w:left="340"/>
+      </w:pPr>
+      <w:r>
+        <w:rPr/>
+        <w:t>• 資料前處理：L ÷ 100、ab ÷ 110（evaluation.py 的 normalize_lab），評分以 uint8 RGB 的 PSNR 計算。</w:t>
       </w:r>
     </w:p>
     <w:p>
@@ -569,6 +1153,26 @@
     <w:p>
       <w:r>
         <w:t>Run controlled experiments: change one thing, keep everything else fixed, record the result on the validation split.</w:t>
+      </w:r>
+    </w:p>
+    <w:p>
+      <w:pPr>
+        <w:spacing w:after="60"/>
+        <w:ind w:left="340"/>
+      </w:pPr>
+      <w:r>
+        <w:rPr/>
+        <w:t>所有實驗使用同一份資料與 seed；PSNR 為驗證集（4000 張）上最佳 epoch 的分數，mean chroma 為該 epoch 的預測平均色度（真實值約 15.2）。</w:t>
+      </w:r>
+    </w:p>
+    <w:p>
+      <w:pPr>
+        <w:spacing w:after="60"/>
+        <w:ind w:left="340"/>
+      </w:pPr>
+      <w:r>
+        <w:rPr/>
+        <w:t>限制：因時間不足，最終版同時加入「平移增強」與「EMA」兩項改動，無法分開各自的貢獻；比較對象為 Baseline（兩者皆無）。</w:t>
       </w:r>
     </w:p>
     <w:p/>
@@ -751,13 +1355,10 @@
             <w:tcW w:w="2434" w:type="dxa"/>
           </w:tcPr>
           <w:p>
-            <w:proofErr w:type="gramStart"/>
-            <w:r>
-              <w:t>your</w:t>
-            </w:r>
-            <w:proofErr w:type="gramEnd"/>
-            <w:r>
-              <w:t xml:space="preserve"> final model</w:t>
+            <w:r/>
+            <w:r>
+              <w:rPr/>
+              <w:t>最終版：Baseline + 平移增強 + EMA（45 epoch）</w:t>
             </w:r>
           </w:p>
         </w:tc>
@@ -765,19 +1366,47 @@
           <w:tcPr>
             <w:tcW w:w="2434" w:type="dxa"/>
           </w:tcPr>
-          <w:p/>
+          <w:p>
+            <w:r/>
+            <w:r>
+              <w:rPr>
+                <w:highlight w:val="yellow"/>
+              </w:rPr>
+              <w:t>【待填】</w:t>
+            </w:r>
+          </w:p>
         </w:tc>
         <w:tc>
           <w:tcPr>
             <w:tcW w:w="2434" w:type="dxa"/>
           </w:tcPr>
-          <w:p/>
+          <w:p>
+            <w:r/>
+            <w:r>
+              <w:rPr>
+                <w:highlight w:val="yellow"/>
+              </w:rPr>
+              <w:t>【待填】</w:t>
+            </w:r>
+          </w:p>
         </w:tc>
         <w:tc>
           <w:tcPr>
             <w:tcW w:w="2434" w:type="dxa"/>
           </w:tcPr>
-          <w:p/>
+          <w:p>
+            <w:r/>
+            <w:r>
+              <w:rPr>
+                <w:highlight w:val="yellow"/>
+              </w:rPr>
+              <w:t>【待填：公開測試集 PSNR】</w:t>
+            </w:r>
+            <w:r>
+              <w:rPr/>
+              <w:t>dB</w:t>
+            </w:r>
+          </w:p>
         </w:tc>
       </w:tr>
       <w:tr>
@@ -786,20 +1415,10 @@
             <w:tcW w:w="2434" w:type="dxa"/>
           </w:tcPr>
           <w:p>
-            <w:pPr>
-              <w:rPr>
-                <w:i/>
-                <w:iCs/>
-                <w:color w:val="BFBFBF" w:themeColor="background1" w:themeShade="BF"/>
-              </w:rPr>
-            </w:pPr>
-            <w:r>
-              <w:rPr>
-                <w:i/>
-                <w:iCs/>
-                <w:color w:val="BFBFBF" w:themeColor="background1" w:themeShade="BF"/>
-              </w:rPr>
-              <w:t>e.g. L1 loss -&gt; L2 loss</w:t>
+            <w:r/>
+            <w:r>
+              <w:rPr/>
+              <w:t>Baseline：翻轉增強、L1、Adam、cosine、60 epoch、無 EMA</w:t>
             </w:r>
           </w:p>
         </w:tc>
@@ -807,70 +1426,37 @@
           <w:tcPr>
             <w:tcW w:w="2434" w:type="dxa"/>
           </w:tcPr>
-          <w:p/>
+          <w:p>
+            <w:r/>
+            <w:r>
+              <w:rPr/>
+              <w:t>25.234</w:t>
+            </w:r>
+          </w:p>
         </w:tc>
         <w:tc>
           <w:tcPr>
             <w:tcW w:w="2434" w:type="dxa"/>
           </w:tcPr>
-          <w:p/>
+          <w:p>
+            <w:r/>
+            <w:r>
+              <w:rPr/>
+              <w:t>7.78</w:t>
+            </w:r>
+          </w:p>
         </w:tc>
         <w:tc>
           <w:tcPr>
             <w:tcW w:w="2434" w:type="dxa"/>
           </w:tcPr>
-          <w:p/>
-        </w:tc>
-      </w:tr>
-      <w:tr>
-        <w:tc>
-          <w:tcPr>
-            <w:tcW w:w="2434" w:type="dxa"/>
-          </w:tcPr>
-          <w:p>
-            <w:pPr>
-              <w:rPr>
-                <w:i/>
-                <w:iCs/>
-                <w:color w:val="BFBFBF" w:themeColor="background1" w:themeShade="BF"/>
-              </w:rPr>
-            </w:pPr>
-            <w:r>
-              <w:rPr>
-                <w:i/>
-                <w:iCs/>
-                <w:color w:val="BFBFBF" w:themeColor="background1" w:themeShade="BF"/>
-              </w:rPr>
-              <w:t xml:space="preserve">e.g. </w:t>
-            </w:r>
-            <w:r>
-              <w:rPr>
-                <w:rFonts w:hint="eastAsia"/>
-                <w:i/>
-                <w:iCs/>
-                <w:color w:val="BFBFBF" w:themeColor="background1" w:themeShade="BF"/>
-              </w:rPr>
-              <w:t>add scheduler</w:t>
-            </w:r>
-          </w:p>
-        </w:tc>
-        <w:tc>
-          <w:tcPr>
-            <w:tcW w:w="2434" w:type="dxa"/>
-          </w:tcPr>
-          <w:p/>
-        </w:tc>
-        <w:tc>
-          <w:tcPr>
-            <w:tcW w:w="2434" w:type="dxa"/>
-          </w:tcPr>
-          <w:p/>
-        </w:tc>
-        <w:tc>
-          <w:tcPr>
-            <w:tcW w:w="2434" w:type="dxa"/>
-          </w:tcPr>
-          <w:p/>
+          <w:p>
+            <w:r/>
+            <w:r>
+              <w:rPr/>
+              <w:t>第 36 epoch 最佳；公開測試集 25.060 dB。之後訓練 loss 繼續下降（0.0692 → 0.0652）但驗證 PSNR 停滯並回落至約 25.07，顯示過擬合</w:t>
+            </w:r>
+          </w:p>
         </w:tc>
       </w:tr>
     </w:tbl>
@@ -937,37 +1523,112 @@
     </w:p>
     <w:p>
       <w:pPr>
-        <w:rPr>
-          <w:i/>
-          <w:iCs/>
-          <w:color w:val="BFBFBF" w:themeColor="background1" w:themeShade="BF"/>
-        </w:rPr>
-      </w:pPr>
-      <w:r>
-        <w:rPr>
-          <w:rFonts w:hint="eastAsia"/>
-          <w:i/>
-          <w:iCs/>
-          <w:color w:val="BFBFBF" w:themeColor="background1" w:themeShade="BF"/>
-        </w:rPr>
-        <w:t>(</w:t>
-      </w:r>
-      <w:r>
-        <w:rPr>
-          <w:i/>
-          <w:iCs/>
-          <w:color w:val="BFBFBF" w:themeColor="background1" w:themeShade="BF"/>
-        </w:rPr>
-        <w:t>Describe the challenges you encountered, how you addressed them, and any related topics you found worth exploring</w:t>
-      </w:r>
-      <w:r>
-        <w:rPr>
-          <w:rFonts w:hint="eastAsia"/>
-          <w:i/>
-          <w:iCs/>
-          <w:color w:val="BFBFBF" w:themeColor="background1" w:themeShade="BF"/>
-        </w:rPr>
-        <w:t>)</w:t>
+        <w:spacing w:after="60"/>
+        <w:ind w:left="340"/>
+      </w:pPr>
+      <w:r>
+        <w:rPr>
+          <w:b/>
+        </w:rPr>
+        <w:t>1. 過擬合</w:t>
+      </w:r>
+    </w:p>
+    <w:p>
+      <w:pPr>
+        <w:spacing w:after="60"/>
+        <w:ind w:left="340"/>
+      </w:pPr>
+      <w:r>
+        <w:rPr/>
+        <w:t>Baseline 的訓練 loss 從 0.0833 一路降到 0.0652，但驗證 PSNR 在 epoch 36 達到最高 25.234 dB 後不再進步，最後 24 個 epoch 回落到約 25.07 dB。處理方式：以驗證 PSNR 最高的 epoch 作為 checkpoint；最終版加入隨機平移增強與 EMA 權重平均，並把 epoch 數降到 45。</w:t>
+      </w:r>
+    </w:p>
+    <w:p>
+      <w:pPr>
+        <w:spacing w:after="60"/>
+        <w:ind w:left="340"/>
+      </w:pPr>
+      <w:r>
+        <w:rPr>
+          <w:b/>
+        </w:rPr>
+        <w:t>2. 預測顏色偏灰</w:t>
+      </w:r>
+    </w:p>
+    <w:p>
+      <w:pPr>
+        <w:spacing w:after="60"/>
+        <w:ind w:left="340"/>
+      </w:pPr>
+      <w:r>
+        <w:rPr/>
+        <w:t>最佳模型的預測平均色度只有 7.68，真實值為 15.30。一個物體常有多種合理的顏色（例如汽車可以是任何顏色），L1 傾向預測中位數、PSNR 又獎勵保守的預測，所以模型傾向輸出低飽和度的顏色。這是 PSNR 與「看起來鮮豔」之間的取捨；可延伸的方向是把 a*b* 當成分類問題（Zhang et al. 的 colorful image colorization）或使用 GAN，但那會犧牲 PSNR，而本作業以 PSNR 評分，因此沒有採用。</w:t>
+      </w:r>
+    </w:p>
+    <w:p>
+      <w:pPr>
+        <w:spacing w:after="60"/>
+        <w:ind w:left="340"/>
+      </w:pPr>
+      <w:r>
+        <w:rPr>
+          <w:b/>
+        </w:rPr>
+        <w:t>3. 驗證分數震盪</w:t>
+      </w:r>
+    </w:p>
+    <w:p>
+      <w:pPr>
+        <w:spacing w:after="60"/>
+        <w:ind w:left="340"/>
+      </w:pPr>
+      <w:r>
+        <w:rPr/>
+        <w:t>驗證 PSNR 在 epoch 8 → 9 從 24.676 掉到 24.517，波動明顯。推測原因是 BatchNorm 加上較大的學習率；cosine 學習率衰減讓後期變穩，最終版再用 EMA 平滑權重。</w:t>
+      </w:r>
+    </w:p>
+    <w:p>
+      <w:pPr>
+        <w:spacing w:after="60"/>
+        <w:ind w:left="340"/>
+      </w:pPr>
+      <w:r>
+        <w:rPr>
+          <w:b/>
+        </w:rPr>
+        <w:t>4. 資料與運算資源</w:t>
+      </w:r>
+    </w:p>
+    <w:p>
+      <w:pPr>
+        <w:spacing w:after="60"/>
+        <w:ind w:left="340"/>
+      </w:pPr>
+      <w:r>
+        <w:rPr/>
+        <w:t>在無 GPU 的環境（CPU）初步測試時，一個 epoch 約 280 s；Colab GPU 約 29 s，約差 10 倍，因此改在 Colab 訓練。訓練用的 float32 Lab 檔案太大無法上傳，我利用 Lab 本來就由 uint8 RGB 轉換而來這點，把資料轉回 uint8 RGB 再壓縮切塊，還原後與原檔數值一致（誤差 &lt; 1e-5）。</w:t>
+      </w:r>
+    </w:p>
+    <w:p>
+      <w:pPr>
+        <w:spacing w:after="60"/>
+        <w:ind w:left="340"/>
+      </w:pPr>
+      <w:r>
+        <w:rPr>
+          <w:b/>
+        </w:rPr>
+        <w:t>5. 結果觀察</w:t>
+      </w:r>
+    </w:p>
+    <w:p>
+      <w:pPr>
+        <w:spacing w:after="60"/>
+        <w:ind w:left="340"/>
+      </w:pPr>
+      <w:r>
+        <w:rPr/>
+        <w:t>驗證集最好的 8 張 PSNR 為 36.48 ～ 40.93 dB，最差的 8 張僅 11.09 ～ 12.70 dB，差距非常大，顯示分數主要被少數顏色難以預測的圖片拉低，值得進一步檢查這些圖片的共同特徵。</w:t>
       </w:r>
     </w:p>
     <w:p/>
@@ -1025,38 +1686,18 @@
     </w:p>
     <w:p>
       <w:pPr>
-        <w:rPr>
-          <w:i/>
-          <w:iCs/>
-          <w:color w:val="BFBFBF" w:themeColor="background1" w:themeShade="BF"/>
-        </w:rPr>
-      </w:pPr>
-      <w:r>
-        <w:rPr>
-          <w:rFonts w:eastAsiaTheme="minorEastAsia" w:hint="eastAsia"/>
-          <w:i/>
-          <w:iCs/>
-          <w:color w:val="BFBFBF" w:themeColor="background1" w:themeShade="BF"/>
-        </w:rPr>
-        <w:t>(</w:t>
-      </w:r>
-      <w:r>
-        <w:rPr>
-          <w:rFonts w:eastAsiaTheme="minorEastAsia"/>
-          <w:i/>
-          <w:iCs/>
-          <w:color w:val="BFBFBF" w:themeColor="background1" w:themeShade="BF"/>
-        </w:rPr>
-        <w:t>Your thoughts, you can write about either the assignments or course content.</w:t>
-      </w:r>
-      <w:r>
-        <w:rPr>
-          <w:rFonts w:eastAsiaTheme="minorEastAsia" w:hint="eastAsia"/>
-          <w:i/>
-          <w:iCs/>
-          <w:color w:val="BFBFBF" w:themeColor="background1" w:themeShade="BF"/>
-        </w:rPr>
-        <w:t>)</w:t>
+        <w:spacing w:after="60"/>
+        <w:ind w:left="340"/>
+      </w:pPr>
+      <w:r>
+        <w:rPr>
+          <w:highlight w:val="yellow"/>
+        </w:rPr>
+        <w:t>【草稿，請改成你自己的想法】</w:t>
+      </w:r>
+      <w:r>
+        <w:rPr/>
+        <w:t>這次作業讓我體會到「評分指標」和「訓練目標」可能不一致：評分用 RGB 空間的 PSNR，訓練卻是在 a*b* 空間用 L1，結果模型學到偏保守、偏灰的顏色。另外也看到訓練 loss 持續下降並不代表泛化變好，必須看驗證集才能判斷何時該停。實作上最大的收穫是學會用 U-Net 的 skip connection 與 dilated convolution 在純卷積的限制下兼顧細節與全域資訊。</w:t>
       </w:r>
     </w:p>
     <w:p/>
@@ -1142,6 +1783,45 @@
       </w:r>
       <w:r>
         <w:t>.</w:t>
+      </w:r>
+    </w:p>
+    <w:p>
+      <w:pPr>
+        <w:spacing w:after="60"/>
+      </w:pPr>
+      <w:r>
+        <w:rPr/>
+        <w:t>本作業有使用 AI：Claude Code（Anthropic）。用途：討論作法、撰寫 model/cnn.py 與 Lab02.ipynb 中待完成的部分、資料壓縮腳本、以及報告初稿；訓練由我自己在 Colab 執行，實驗結果與數字都來自我的執行輸出，AI 協助整理與撰寫。</w:t>
+      </w:r>
+    </w:p>
+    <w:p>
+      <w:pPr>
+        <w:spacing w:after="60"/>
+      </w:pPr>
+      <w:r>
+        <w:rPr/>
+        <w:t xml:space="preserve">AI 對話連結：https://claude.ai/code/session_01P6RdPC5AV61n2e3qSM1CP7 </w:t>
+      </w:r>
+      <w:r>
+        <w:rPr>
+          <w:highlight w:val="yellow"/>
+        </w:rPr>
+        <w:t>【請確認該連結已開啟分享、他人可以開啟】</w:t>
+      </w:r>
+    </w:p>
+    <w:p>
+      <w:pPr>
+        <w:spacing w:after="60"/>
+      </w:pPr>
+      <w:r>
+        <w:rPr/>
+        <w:t>Key prompts：</w:t>
+      </w:r>
+      <w:r>
+        <w:rPr>
+          <w:highlight w:val="yellow"/>
+        </w:rPr>
+        <w:t>【待填：貼上 3–5 個主要提示的截圖】</w:t>
       </w:r>
     </w:p>
     <w:p/>

</xml_diff>

<commit_message>
Lab02: rebuild report on the new template
Co-Authored-By: Claude Sonnet 5.5 <noreply@anthropic.com>
Claude-Session: https://claude.ai/code/session_01P6RdPC5AV61n2e3qSM1CP7
</commit_message>
<xml_diff>
--- a/Lab02/report/Lab02_report_115505009.docx
+++ b/Lab02/report/Lab02_report_115505009.docx
@@ -143,13 +143,10 @@
               <w:jc w:val="both"/>
             </w:pPr>
             <w:r>
-              <w:t xml:space="preserve">Name: </w:t>
-            </w:r>
-            <w:r>
-              <w:rPr>
-                <w:rFonts w:hint="eastAsia"/>
-              </w:rPr>
-              <w:t>許逸凡</w:t>
+              <w:t>Name:</w:t>
+            </w:r>
+            <w:r>
+              <w:t xml:space="preserve"> 許逸凡</w:t>
             </w:r>
           </w:p>
         </w:tc>
@@ -164,7 +161,10 @@
               <w:jc w:val="both"/>
             </w:pPr>
             <w:r>
-              <w:t xml:space="preserve">Student ID: 115505009</w:t>
+              <w:t>Student ID:</w:t>
+            </w:r>
+            <w:r>
+              <w:t xml:space="preserve"> 115505009</w:t>
             </w:r>
           </w:p>
         </w:tc>

</xml_diff>

<commit_message>
Lab02: fill final results in report (test PSNR 25.177 dB)
Co-Authored-By: Claude Sonnet 5.5 <noreply@anthropic.com>
Claude-Session: https://claude.ai/code/session_01P6RdPC5AV61n2e3qSM1CP7
</commit_message>
<xml_diff>
--- a/Lab02/report/Lab02_report_115505009.docx
+++ b/Lab02/report/Lab02_report_115505009.docx
@@ -351,17 +351,7 @@
       </w:pPr>
       <w:r>
         <w:rPr/>
-        <w:t>Baseline 公開測試集 PSNR：25.060 dB（grey baseline 23.49 dB，+1.570 dB）；最終版：</w:t>
-      </w:r>
-      <w:r>
-        <w:rPr>
-          <w:highlight w:val="yellow"/>
-        </w:rPr>
-        <w:t>【待填：最終 test PSNR (Base)】</w:t>
-      </w:r>
-      <w:r>
-        <w:rPr/>
-        <w:t xml:space="preserve"> dB。</w:t>
+        <w:t>公開測試集 PSNR：最終版 25.177 dB（grey baseline 23.49 dB，+1.687 dB）；Baseline（無 shift 增強與 EMA）為 25.060 dB。</w:t>
       </w:r>
     </w:p>
     <w:p>
@@ -1055,17 +1045,7 @@
       </w:pPr>
       <w:r>
         <w:rPr/>
-        <w:t>• 硬體：Google Colab GPU。時間：Baseline 1717 s（約 29 s / epoch）；最終版</w:t>
-      </w:r>
-      <w:r>
-        <w:rPr>
-          <w:highlight w:val="yellow"/>
-        </w:rPr>
-        <w:t>【待填：total time】</w:t>
-      </w:r>
-      <w:r>
-        <w:rPr/>
-        <w:t xml:space="preserve"> s。</w:t>
+        <w:t>• 硬體：Google Colab GPU。時間：最終版 1275 s（45 epoch，約 28 s / epoch）；Baseline 1717 s（60 epoch）。</w:t>
       </w:r>
     </w:p>
     <w:p>
@@ -1367,12 +1347,9 @@
             <w:tcW w:w="2434" w:type="dxa"/>
           </w:tcPr>
           <w:p>
-            <w:r/>
-            <w:r>
-              <w:rPr>
-                <w:highlight w:val="yellow"/>
-              </w:rPr>
-              <w:t>【待填】</w:t>
+            <w:r>
+              <w:rPr/>
+              <w:t>25.307</w:t>
             </w:r>
           </w:p>
         </w:tc>
@@ -1381,12 +1358,9 @@
             <w:tcW w:w="2434" w:type="dxa"/>
           </w:tcPr>
           <w:p>
-            <w:r/>
-            <w:r>
-              <w:rPr>
-                <w:highlight w:val="yellow"/>
-              </w:rPr>
-              <w:t>【待填】</w:t>
+            <w:r>
+              <w:rPr/>
+              <w:t>8.73</w:t>
             </w:r>
           </w:p>
         </w:tc>
@@ -1395,16 +1369,9 @@
             <w:tcW w:w="2434" w:type="dxa"/>
           </w:tcPr>
           <w:p>
-            <w:r/>
-            <w:r>
-              <w:rPr>
-                <w:highlight w:val="yellow"/>
-              </w:rPr>
-              <w:t>【待填：公開測試集 PSNR】</w:t>
-            </w:r>
             <w:r>
               <w:rPr/>
-              <w:t>dB</w:t>
+              <w:t>第 42 epoch 最佳；公開測試集 25.177 dB（比 Baseline +0.117 dB）；曲線平穩、無回落</w:t>
             </w:r>
           </w:p>
         </w:tc>
@@ -1540,7 +1507,7 @@
       </w:pPr>
       <w:r>
         <w:rPr/>
-        <w:t>Baseline 的訓練 loss 從 0.0833 一路降到 0.0652，但驗證 PSNR 在 epoch 36 達到最高 25.234 dB 後不再進步，最後 24 個 epoch 回落到約 25.07 dB。處理方式：以驗證 PSNR 最高的 epoch 作為 checkpoint；最終版加入隨機平移增強與 EMA 權重平均，並把 epoch 數降到 45。</w:t>
+        <w:t>Baseline 的訓練 loss 從 0.0833 一路降到 0.0652，但驗證 PSNR 在 epoch 36 達到最高 25.234 dB 後不再進步，最後 24 個 epoch 回落到約 25.07 dB。處理方式：最終版加入隨機平移增強與 EMA 權重平均，並把 epoch 數降到 45。結果驗證 PSNR 不再回落，而是平穩收斂到 25.307 dB（epoch 42 之後幾乎不變），公開測試集也從 25.060 提升到 25.177 dB。</w:t>
       </w:r>
     </w:p>
     <w:p>
@@ -1562,7 +1529,7 @@
       </w:pPr>
       <w:r>
         <w:rPr/>
-        <w:t>最佳模型的預測平均色度只有 7.68，真實值為 15.30。一個物體常有多種合理的顏色（例如汽車可以是任何顏色），L1 傾向預測中位數、PSNR 又獎勵保守的預測，所以模型傾向輸出低飽和度的顏色。這是 PSNR 與「看起來鮮豔」之間的取捨；可延伸的方向是把 a*b* 當成分類問題（Zhang et al. 的 colorful image colorization）或使用 GAN，但那會犧牲 PSNR，而本作業以 PSNR 評分，因此沒有採用。</w:t>
+        <w:t>公開測試集上，Baseline 的預測平均色度只有 7.68、最終版為 8.84，真實值為 15.30。一個物體常有多種合理的顏色（例如汽車可以是任何顏色），L1 傾向預測中位數、PSNR 又獎勵保守的預測，所以模型傾向輸出低飽和度的顏色。這是 PSNR 與「看起來鮮豔」之間的取捨；可延伸的方向是把 a*b* 當成分類問題（Zhang et al. 的 colorful image colorization）或使用 GAN，但那會犧牲 PSNR，而本作業以 PSNR 評分，因此沒有採用。</w:t>
       </w:r>
     </w:p>
     <w:p>
@@ -1584,7 +1551,7 @@
       </w:pPr>
       <w:r>
         <w:rPr/>
-        <w:t>驗證 PSNR 在 epoch 8 → 9 從 24.676 掉到 24.517，波動明顯。推測原因是 BatchNorm 加上較大的學習率；cosine 學習率衰減讓後期變穩，最終版再用 EMA 平滑權重。</w:t>
+        <w:t>Baseline 的驗證 PSNR 在 epoch 8 → 9 從 24.676 掉到 24.517，波動明顯。推測原因是 BatchNorm 加上較大的學習率。最終版用 EMA 平滑權重後，從 epoch 14 起 PSNR 單調上升到 25.307，幾乎沒有震盪。另外 EMA 版前 10 個 epoch 分數反而偏低（最低 23.237 dB，此時預測色度高達 12.95），因為 EMA 平均到的是早期尚未訓練好的權重，等舊權重的比重衰減後才恢復；這也說明 EMA 的 decay 越大，需要的暖機時間越長。</w:t>
       </w:r>
     </w:p>
     <w:p>

</xml_diff>